<commit_message>
Add new illustration for Chapter 3 in history section
</commit_message>
<xml_diff>
--- a/trivia_outputs/d4277143/Classic_Arcade_Trivia.docx
+++ b/trivia_outputs/d4277143/Classic_Arcade_Trivia.docx
@@ -1852,7 +1852,7 @@
         <w:t xml:space="preserve">1. </w:t>
       </w:r>
       <w:r>
-        <w:t>C — Puck Man</w:t>
+        <w:t>C - Puck Man</w:t>
       </w:r>
     </w:p>
     <w:p>
@@ -1866,7 +1866,7 @@
         <w:t xml:space="preserve">2. </w:t>
       </w:r>
       <w:r>
-        <w:t>B — Toru Iwatani</w:t>
+        <w:t>B - Toru Iwatani</w:t>
       </w:r>
     </w:p>
     <w:p>
@@ -1880,7 +1880,7 @@
         <w:t xml:space="preserve">3. </w:t>
       </w:r>
       <w:r>
-        <w:t>D — The right half of the screen becomes garbled and the level is unbeatable</w:t>
+        <w:t>D - The right half of the screen becomes garbled and the level is unbeatable</w:t>
       </w:r>
     </w:p>
     <w:p>
@@ -1894,7 +1894,7 @@
         <w:t xml:space="preserve">4. </w:t>
       </w:r>
       <w:r>
-        <w:t>A — Clyde (orange)</w:t>
+        <w:t>A - Clyde (orange)</w:t>
       </w:r>
     </w:p>
     <w:p>
@@ -1908,7 +1908,7 @@
         <w:t xml:space="preserve">5. </w:t>
       </w:r>
       <w:r>
-        <w:t>C — Ms. Pac-Man</w:t>
+        <w:t>C - Ms. Pac-Man</w:t>
       </w:r>
     </w:p>
     <w:p>
@@ -1922,7 +1922,7 @@
         <w:t xml:space="preserve">6. </w:t>
       </w:r>
       <w:r>
-        <w:t>C — 240</w:t>
+        <w:t>C - 240</w:t>
       </w:r>
     </w:p>
     <w:p>
@@ -1936,7 +1936,7 @@
         <w:t xml:space="preserve">7. </w:t>
       </w:r>
       <w:r>
-        <w:t>B — Midway Manufacturing</w:t>
+        <w:t>B - Midway Manufacturing</w:t>
       </w:r>
     </w:p>
     <w:p>
@@ -1950,7 +1950,7 @@
         <w:t xml:space="preserve">8. </w:t>
       </w:r>
       <w:r>
-        <w:t>D — Cherry</w:t>
+        <w:t>D - Cherry</w:t>
       </w:r>
     </w:p>
     <w:p>
@@ -1972,7 +1972,7 @@
         <w:t xml:space="preserve">1. </w:t>
       </w:r>
       <w:r>
-        <w:t>C — Shigeru Miyamoto</w:t>
+        <w:t>C - Shigeru Miyamoto</w:t>
       </w:r>
     </w:p>
     <w:p>
@@ -1986,7 +1986,7 @@
         <w:t xml:space="preserve">2. </w:t>
       </w:r>
       <w:r>
-        <w:t>A — Jumpman</w:t>
+        <w:t>A - Jumpman</w:t>
       </w:r>
     </w:p>
     <w:p>
@@ -2000,7 +2000,7 @@
         <w:t xml:space="preserve">3. </w:t>
       </w:r>
       <w:r>
-        <w:t>D — 4</w:t>
+        <w:t>D - 4</w:t>
       </w:r>
     </w:p>
     <w:p>
@@ -2014,7 +2014,7 @@
         <w:t xml:space="preserve">4. </w:t>
       </w:r>
       <w:r>
-        <w:t>B — Universal City Studios</w:t>
+        <w:t>B - Universal City Studios</w:t>
       </w:r>
     </w:p>
     <w:p>
@@ -2028,7 +2028,7 @@
         <w:t xml:space="preserve">5. </w:t>
       </w:r>
       <w:r>
-        <w:t>C — A hammer</w:t>
+        <w:t>C - A hammer</w:t>
       </w:r>
     </w:p>
     <w:p>
@@ -2042,7 +2042,7 @@
         <w:t xml:space="preserve">6. </w:t>
       </w:r>
       <w:r>
-        <w:t>D — Steve Wiebe</w:t>
+        <w:t>D - Steve Wiebe</w:t>
       </w:r>
     </w:p>
     <w:p>
@@ -2056,7 +2056,7 @@
         <w:t xml:space="preserve">7. </w:t>
       </w:r>
       <w:r>
-        <w:t>B — Pauline</w:t>
+        <w:t>B - Pauline</w:t>
       </w:r>
     </w:p>
     <w:p>
@@ -2070,7 +2070,7 @@
         <w:t xml:space="preserve">8. </w:t>
       </w:r>
       <w:r>
-        <w:t>A — Popeye</w:t>
+        <w:t>A - Popeye</w:t>
       </w:r>
     </w:p>
     <w:p>
@@ -2092,7 +2092,7 @@
         <w:t xml:space="preserve">1. </w:t>
       </w:r>
       <w:r>
-        <w:t>C — Tomohiro Nishikado</w:t>
+        <w:t>C - Tomohiro Nishikado</w:t>
       </w:r>
     </w:p>
     <w:p>
@@ -2106,7 +2106,7 @@
         <w:t xml:space="preserve">2. </w:t>
       </w:r>
       <w:r>
-        <w:t>A — 1978</w:t>
+        <w:t>A - 1978</w:t>
       </w:r>
     </w:p>
     <w:p>
@@ -2120,7 +2120,7 @@
         <w:t xml:space="preserve">3. </w:t>
       </w:r>
       <w:r>
-        <w:t>B — The hardware renders fewer sprites faster, causing the remaining aliens to move more quickly</w:t>
+        <w:t>B - The hardware renders fewer sprites faster, causing the remaining aliens to move more quickly</w:t>
       </w:r>
     </w:p>
     <w:p>
@@ -2134,7 +2134,7 @@
         <w:t xml:space="preserve">4. </w:t>
       </w:r>
       <w:r>
-        <w:t>D — 5</w:t>
+        <w:t>D - 5</w:t>
       </w:r>
     </w:p>
     <w:p>
@@ -2148,7 +2148,7 @@
         <w:t xml:space="preserve">5. </w:t>
       </w:r>
       <w:r>
-        <w:t>D — The 100-yen coin</w:t>
+        <w:t>D - The 100-yen coin</w:t>
       </w:r>
     </w:p>
     <w:p>
@@ -2162,7 +2162,7 @@
         <w:t xml:space="preserve">6. </w:t>
       </w:r>
       <w:r>
-        <w:t>A — Midway</w:t>
+        <w:t>A - Midway</w:t>
       </w:r>
     </w:p>
     <w:p>
@@ -2176,7 +2176,7 @@
         <w:t xml:space="preserve">7. </w:t>
       </w:r>
       <w:r>
-        <w:t>D — 300</w:t>
+        <w:t>D - 300</w:t>
       </w:r>
     </w:p>
     <w:p>
@@ -2190,7 +2190,7 @@
         <w:t xml:space="preserve">8. </w:t>
       </w:r>
       <w:r>
-        <w:t>B — Atari 2600</w:t>
+        <w:t>B - Atari 2600</w:t>
       </w:r>
     </w:p>
     <w:sectPr>

</xml_diff>